<commit_message>
update resume/CV links to view-first with download option, sync lightbox transitions
</commit_message>
<xml_diff>
--- a/cv.docx
+++ b/cv.docx
@@ -2056,7 +2056,7 @@
                 <w:color w:val="3B444F"/>
                 <w:sz w:val="15"/>
               </w:rPr>
-              <w:t>Leading the ACES CodeFest 2026 UI/UX Challenge entry — redesigning the ACES website into a mobile-first experience across 9 pages in a 2-week sprint.</w:t>
+              <w:t>Won 2nd Place at ACES CodeFest 2026 UI/UX Challenge — redesigned the ACES KNUST website for mobile across all 9 pages as a team of 5, building a clickable Figma prototype with real-time collaboration.</w:t>
             </w:r>
           </w:p>
           <w:p>
@@ -3245,7 +3245,7 @@
                 <w:color w:val="0F2B46"/>
                 <w:sz w:val="17"/>
               </w:rPr>
-              <w:t>Solar-Powered IoT Watering System</w:t>
+              <w:t>Solar-Powered Automated Water Dispenser</w:t>
             </w:r>
           </w:p>
           <w:p>
@@ -3261,7 +3261,7 @@
                 <w:color w:val="C9A54E"/>
                 <w:sz w:val="14"/>
               </w:rPr>
-              <w:t>Arduino · IR Sensor · C++ · Solar</w:t>
+              <w:t>Arduino · Ultrasonic Sensors · C++ · Solar</w:t>
             </w:r>
           </w:p>
           <w:p>
@@ -3283,7 +3283,7 @@
                 <w:color w:val="3B444F"/>
                 <w:sz w:val="15"/>
               </w:rPr>
-              <w:t>Designed sensor-driven embedded system with proximity-triggered actuation — edge computing for IoT agriculture.</w:t>
+              <w:t>Built a solar-powered water dispensing system using dual ultrasonic sensors (HC-SR04) to detect container placement and monitor fill level in real time, automatically controlling a solenoid valve.</w:t>
             </w:r>
           </w:p>
           <w:p>
@@ -3305,7 +3305,7 @@
                 <w:color w:val="3B444F"/>
                 <w:sz w:val="15"/>
               </w:rPr>
-              <w:t>Full circuit: solar charge controller, relay logic, IR sensor array, C++ firmware on Arduino.</w:t>
+              <w:t>Implemented debounce logic to prevent false triggers, buzzer for audio feedback, and LED status indicators for system state.</w:t>
             </w:r>
           </w:p>
           <w:p>
@@ -3327,7 +3327,7 @@
                 <w:color w:val="3B444F"/>
                 <w:sz w:val="15"/>
               </w:rPr>
-              <w:t>Solar power with voltage regulation for off-grid operation.</w:t>
+              <w:t>Solar power with voltage regulation for off-grid deployment in areas without reliable electricity.</w:t>
             </w:r>
           </w:p>
           <w:p>
@@ -3570,8 +3570,7 @@
               <w:rPr>
                 <w:rFonts w:ascii="Calibri" w:hAnsi="Calibri"/>
                 <w:b/>
-                <w:i/>
-                <w:color w:val="B05020"/>
+                <w:color w:val="0F2B46"/>
                 <w:sz w:val="16"/>
               </w:rPr>
               <w:t>ACES CodeFest 2026</w:t>
@@ -3579,11 +3578,10 @@
             <w:r>
               <w:rPr>
                 <w:rFonts w:ascii="Calibri" w:hAnsi="Calibri"/>
-                <w:i/>
-                <w:color w:val="B05020"/>
+                <w:color w:val="6B7480"/>
                 <w:sz w:val="16"/>
               </w:rPr>
-              <w:t xml:space="preserve"> — UI/UX Challenge — Upcoming</w:t>
+              <w:t xml:space="preserve"> — 2nd Place — UI/UX Design</w:t>
             </w:r>
             <w:r>
               <w:rPr>
@@ -3602,7 +3600,7 @@
             <w:r>
               <w:rPr>
                 <w:rFonts w:ascii="Calibri" w:hAnsi="Calibri"/>
-                <w:color w:val="B05020"/>
+                <w:color w:val="C9A54E"/>
                 <w:sz w:val="15"/>
               </w:rPr>
               <w:t xml:space="preserve">• </w:t>
@@ -3610,11 +3608,10 @@
             <w:r>
               <w:rPr>
                 <w:rFonts w:ascii="Calibri" w:hAnsi="Calibri"/>
-                <w:i/>
-                <w:color w:val="B05020"/>
+                <w:color w:val="3B444F"/>
                 <w:sz w:val="15"/>
               </w:rPr>
-              <w:t>Competing in the ACES KNUST CodeFest UI/UX challenge — redesigning the ACES website into a mobile-first experience across 9 pages in a 2-week sprint.</w:t>
+              <w:t>Redesigned the ACES KNUST website for mobile across all 9 pages as a team of 5. Built a high-fidelity clickable prototype in Figma with real-time collaboration, focusing on visual hierarchy, touch-friendly navigation, and user flows.</w:t>
             </w:r>
           </w:p>
           <w:p>

</xml_diff>